<commit_message>
annuaire: canary pour capture dashboard (analyse en cours)
</commit_message>
<xml_diff>
--- a/RAPPORT.docx
+++ b/RAPPORT.docx
@@ -75,19 +75,51 @@
         <w:pStyle w:val="Subtitle"/>
       </w:pPr>
       <w:r>
-        <w:t xml:space="preserve">Rapport</w:t>
-      </w:r>
-      <w:r>
-        <w:t xml:space="preserve"> </w:t>
-      </w:r>
-      <w:r>
-        <w:t xml:space="preserve">de</w:t>
-      </w:r>
-      <w:r>
-        <w:t xml:space="preserve"> </w:t>
-      </w:r>
-      <w:r>
-        <w:t xml:space="preserve">binôme</w:t>
+        <w:t xml:space="preserve">Argo</w:t>
+      </w:r>
+      <w:r>
+        <w:t xml:space="preserve"> </w:t>
+      </w:r>
+      <w:r>
+        <w:t xml:space="preserve">Rollouts</w:t>
+      </w:r>
+      <w:r>
+        <w:t xml:space="preserve"> </w:t>
+      </w:r>
+      <w:r>
+        <w:t xml:space="preserve">·</w:t>
+      </w:r>
+      <w:r>
+        <w:t xml:space="preserve"> </w:t>
+      </w:r>
+      <w:r>
+        <w:t xml:space="preserve">Prometheus</w:t>
+      </w:r>
+      <w:r>
+        <w:t xml:space="preserve"> </w:t>
+      </w:r>
+      <w:r>
+        <w:t xml:space="preserve">·</w:t>
+      </w:r>
+      <w:r>
+        <w:t xml:space="preserve"> </w:t>
+      </w:r>
+      <w:r>
+        <w:t xml:space="preserve">Alertmanager</w:t>
+      </w:r>
+    </w:p>
+    <w:p>
+      <w:pPr>
+        <w:pStyle w:val="Author"/>
+      </w:pPr>
+      <w:r>
+        <w:t xml:space="preserve">Évan</w:t>
+      </w:r>
+      <w:r>
+        <w:t xml:space="preserve"> </w:t>
+      </w:r>
+      <w:r>
+        <w:t xml:space="preserve">Lefevre</w:t>
       </w:r>
       <w:r>
         <w:t xml:space="preserve"> </w:t>
@@ -99,57 +131,19 @@
         <w:t xml:space="preserve"> </w:t>
       </w:r>
       <w:r>
-        <w:t xml:space="preserve">Argo</w:t>
-      </w:r>
-      <w:r>
-        <w:t xml:space="preserve"> </w:t>
-      </w:r>
-      <w:r>
-        <w:t xml:space="preserve">Rollouts</w:t>
-      </w:r>
-      <w:r>
-        <w:t xml:space="preserve"> </w:t>
-      </w:r>
-      <w:r>
-        <w:t xml:space="preserve">·</w:t>
-      </w:r>
-      <w:r>
-        <w:t xml:space="preserve"> </w:t>
-      </w:r>
-      <w:r>
-        <w:t xml:space="preserve">Prometheus</w:t>
-      </w:r>
-      <w:r>
-        <w:t xml:space="preserve"> </w:t>
-      </w:r>
-      <w:r>
-        <w:t xml:space="preserve">·</w:t>
-      </w:r>
-      <w:r>
-        <w:t xml:space="preserve"> </w:t>
-      </w:r>
-      <w:r>
-        <w:t xml:space="preserve">Alertmanager</w:t>
-      </w:r>
-    </w:p>
-    <w:p>
-      <w:pPr>
-        <w:pStyle w:val="Author"/>
-      </w:pPr>
-      <w:r>
-        <w:t xml:space="preserve">Evan</w:t>
-      </w:r>
-      <w:r>
-        <w:t xml:space="preserve"> </w:t>
-      </w:r>
-      <w:r>
-        <w:t xml:space="preserve">Lefevre</w:t>
-      </w:r>
-      <w:r>
-        <w:t xml:space="preserve"> </w:t>
-      </w:r>
-      <w:r>
-        <w:t xml:space="preserve">(evanlefevre)</w:t>
+        <w:t xml:space="preserve">ESGI</w:t>
+      </w:r>
+      <w:r>
+        <w:t xml:space="preserve"> </w:t>
+      </w:r>
+      <w:r>
+        <w:t xml:space="preserve">5</w:t>
+      </w:r>
+      <w:r>
+        <w:t xml:space="preserve"> </w:t>
+      </w:r>
+      <w:r>
+        <w:t xml:space="preserve">SRC</w:t>
       </w:r>
     </w:p>
     <w:p>

</xml_diff>